<commit_message>
add session auth and update admin
</commit_message>
<xml_diff>
--- a/documents/Phân tích nghiệp vụ khách hàng.docx
+++ b/documents/Phân tích nghiệp vụ khách hàng.docx
@@ -26,8 +26,8 @@
       <w:tblGrid>
         <w:gridCol w:w="715"/>
         <w:gridCol w:w="2070"/>
-        <w:gridCol w:w="2070"/>
-        <w:gridCol w:w="4495"/>
+        <w:gridCol w:w="2313"/>
+        <w:gridCol w:w="4252"/>
       </w:tblGrid>
       <w:tr>
         <w:trPr>
@@ -83,7 +83,7 @@
         </w:tc>
         <w:tc>
           <w:tcPr>
-            <w:tcW w:w="2040" w:type="dxa"/>
+            <w:tcW w:w="2283" w:type="dxa"/>
             <w:vAlign w:val="center"/>
             <w:hideMark/>
           </w:tcPr>
@@ -106,7 +106,7 @@
         </w:tc>
         <w:tc>
           <w:tcPr>
-            <w:tcW w:w="4450" w:type="dxa"/>
+            <w:tcW w:w="4207" w:type="dxa"/>
             <w:vAlign w:val="center"/>
             <w:hideMark/>
           </w:tcPr>
@@ -164,7 +164,7 @@
         </w:tc>
         <w:tc>
           <w:tcPr>
-            <w:tcW w:w="2040" w:type="dxa"/>
+            <w:tcW w:w="2283" w:type="dxa"/>
             <w:vAlign w:val="center"/>
           </w:tcPr>
           <w:p>
@@ -178,7 +178,7 @@
         </w:tc>
         <w:tc>
           <w:tcPr>
-            <w:tcW w:w="4450" w:type="dxa"/>
+            <w:tcW w:w="4207" w:type="dxa"/>
             <w:vAlign w:val="center"/>
           </w:tcPr>
           <w:p>
@@ -228,7 +228,7 @@
         </w:tc>
         <w:tc>
           <w:tcPr>
-            <w:tcW w:w="2040" w:type="dxa"/>
+            <w:tcW w:w="2283" w:type="dxa"/>
             <w:vAlign w:val="center"/>
             <w:hideMark/>
           </w:tcPr>
@@ -243,7 +243,7 @@
         </w:tc>
         <w:tc>
           <w:tcPr>
-            <w:tcW w:w="4450" w:type="dxa"/>
+            <w:tcW w:w="4207" w:type="dxa"/>
             <w:vAlign w:val="center"/>
             <w:hideMark/>
           </w:tcPr>
@@ -294,7 +294,7 @@
         </w:tc>
         <w:tc>
           <w:tcPr>
-            <w:tcW w:w="2040" w:type="dxa"/>
+            <w:tcW w:w="2283" w:type="dxa"/>
             <w:vAlign w:val="center"/>
             <w:hideMark/>
           </w:tcPr>
@@ -309,7 +309,7 @@
         </w:tc>
         <w:tc>
           <w:tcPr>
-            <w:tcW w:w="4450" w:type="dxa"/>
+            <w:tcW w:w="4207" w:type="dxa"/>
             <w:vAlign w:val="center"/>
             <w:hideMark/>
           </w:tcPr>
@@ -360,7 +360,7 @@
         </w:tc>
         <w:tc>
           <w:tcPr>
-            <w:tcW w:w="2040" w:type="dxa"/>
+            <w:tcW w:w="2283" w:type="dxa"/>
             <w:vAlign w:val="center"/>
             <w:hideMark/>
           </w:tcPr>
@@ -375,7 +375,7 @@
         </w:tc>
         <w:tc>
           <w:tcPr>
-            <w:tcW w:w="4450" w:type="dxa"/>
+            <w:tcW w:w="4207" w:type="dxa"/>
             <w:vAlign w:val="center"/>
             <w:hideMark/>
           </w:tcPr>
@@ -426,7 +426,7 @@
         </w:tc>
         <w:tc>
           <w:tcPr>
-            <w:tcW w:w="2040" w:type="dxa"/>
+            <w:tcW w:w="2283" w:type="dxa"/>
             <w:vAlign w:val="center"/>
             <w:hideMark/>
           </w:tcPr>
@@ -441,7 +441,7 @@
         </w:tc>
         <w:tc>
           <w:tcPr>
-            <w:tcW w:w="4450" w:type="dxa"/>
+            <w:tcW w:w="4207" w:type="dxa"/>
             <w:vAlign w:val="center"/>
             <w:hideMark/>
           </w:tcPr>
@@ -492,7 +492,7 @@
         </w:tc>
         <w:tc>
           <w:tcPr>
-            <w:tcW w:w="2040" w:type="dxa"/>
+            <w:tcW w:w="2283" w:type="dxa"/>
             <w:vAlign w:val="center"/>
             <w:hideMark/>
           </w:tcPr>
@@ -507,7 +507,7 @@
         </w:tc>
         <w:tc>
           <w:tcPr>
-            <w:tcW w:w="4450" w:type="dxa"/>
+            <w:tcW w:w="4207" w:type="dxa"/>
             <w:vAlign w:val="center"/>
             <w:hideMark/>
           </w:tcPr>
@@ -558,7 +558,7 @@
         </w:tc>
         <w:tc>
           <w:tcPr>
-            <w:tcW w:w="2040" w:type="dxa"/>
+            <w:tcW w:w="2283" w:type="dxa"/>
             <w:vAlign w:val="center"/>
             <w:hideMark/>
           </w:tcPr>
@@ -573,7 +573,7 @@
         </w:tc>
         <w:tc>
           <w:tcPr>
-            <w:tcW w:w="4450" w:type="dxa"/>
+            <w:tcW w:w="4207" w:type="dxa"/>
             <w:vAlign w:val="center"/>
             <w:hideMark/>
           </w:tcPr>
@@ -618,13 +618,13 @@
               <w:jc w:val="center"/>
             </w:pPr>
             <w:r>
-              <w:t>Chọn ghế realtime</w:t>
-            </w:r>
-          </w:p>
-        </w:tc>
-        <w:tc>
-          <w:tcPr>
-            <w:tcW w:w="2040" w:type="dxa"/>
+              <w:t>Chọn ghế</w:t>
+            </w:r>
+          </w:p>
+        </w:tc>
+        <w:tc>
+          <w:tcPr>
+            <w:tcW w:w="2283" w:type="dxa"/>
             <w:vAlign w:val="center"/>
             <w:hideMark/>
           </w:tcPr>
@@ -639,7 +639,7 @@
         </w:tc>
         <w:tc>
           <w:tcPr>
-            <w:tcW w:w="4450" w:type="dxa"/>
+            <w:tcW w:w="4207" w:type="dxa"/>
             <w:vAlign w:val="center"/>
             <w:hideMark/>
           </w:tcPr>
@@ -690,7 +690,7 @@
         </w:tc>
         <w:tc>
           <w:tcPr>
-            <w:tcW w:w="2040" w:type="dxa"/>
+            <w:tcW w:w="2283" w:type="dxa"/>
             <w:vAlign w:val="center"/>
             <w:hideMark/>
           </w:tcPr>
@@ -705,7 +705,7 @@
         </w:tc>
         <w:tc>
           <w:tcPr>
-            <w:tcW w:w="4450" w:type="dxa"/>
+            <w:tcW w:w="4207" w:type="dxa"/>
             <w:vAlign w:val="center"/>
             <w:hideMark/>
           </w:tcPr>
@@ -756,7 +756,7 @@
         </w:tc>
         <w:tc>
           <w:tcPr>
-            <w:tcW w:w="2040" w:type="dxa"/>
+            <w:tcW w:w="2283" w:type="dxa"/>
             <w:vAlign w:val="center"/>
             <w:hideMark/>
           </w:tcPr>
@@ -771,7 +771,7 @@
         </w:tc>
         <w:tc>
           <w:tcPr>
-            <w:tcW w:w="4450" w:type="dxa"/>
+            <w:tcW w:w="4207" w:type="dxa"/>
             <w:vAlign w:val="center"/>
             <w:hideMark/>
           </w:tcPr>
@@ -822,7 +822,7 @@
         </w:tc>
         <w:tc>
           <w:tcPr>
-            <w:tcW w:w="2040" w:type="dxa"/>
+            <w:tcW w:w="2283" w:type="dxa"/>
             <w:vAlign w:val="center"/>
             <w:hideMark/>
           </w:tcPr>
@@ -837,7 +837,7 @@
         </w:tc>
         <w:tc>
           <w:tcPr>
-            <w:tcW w:w="4450" w:type="dxa"/>
+            <w:tcW w:w="4207" w:type="dxa"/>
             <w:vAlign w:val="center"/>
             <w:hideMark/>
           </w:tcPr>
@@ -888,7 +888,7 @@
         </w:tc>
         <w:tc>
           <w:tcPr>
-            <w:tcW w:w="2040" w:type="dxa"/>
+            <w:tcW w:w="2283" w:type="dxa"/>
             <w:vAlign w:val="center"/>
             <w:hideMark/>
           </w:tcPr>
@@ -903,7 +903,7 @@
         </w:tc>
         <w:tc>
           <w:tcPr>
-            <w:tcW w:w="4450" w:type="dxa"/>
+            <w:tcW w:w="4207" w:type="dxa"/>
             <w:vAlign w:val="center"/>
             <w:hideMark/>
           </w:tcPr>
@@ -952,7 +952,7 @@
         </w:tc>
         <w:tc>
           <w:tcPr>
-            <w:tcW w:w="2040" w:type="dxa"/>
+            <w:tcW w:w="2283" w:type="dxa"/>
             <w:vAlign w:val="center"/>
           </w:tcPr>
           <w:p>
@@ -966,7 +966,7 @@
         </w:tc>
         <w:tc>
           <w:tcPr>
-            <w:tcW w:w="4450" w:type="dxa"/>
+            <w:tcW w:w="4207" w:type="dxa"/>
             <w:vAlign w:val="center"/>
           </w:tcPr>
           <w:p>
@@ -1016,7 +1016,7 @@
         </w:tc>
         <w:tc>
           <w:tcPr>
-            <w:tcW w:w="2040" w:type="dxa"/>
+            <w:tcW w:w="2283" w:type="dxa"/>
             <w:vAlign w:val="center"/>
             <w:hideMark/>
           </w:tcPr>
@@ -1031,7 +1031,7 @@
         </w:tc>
         <w:tc>
           <w:tcPr>
-            <w:tcW w:w="4450" w:type="dxa"/>
+            <w:tcW w:w="4207" w:type="dxa"/>
             <w:vAlign w:val="center"/>
             <w:hideMark/>
           </w:tcPr>
@@ -1791,60 +1791,60 @@
           </w:tcPr>
           <w:p>
             <w:r>
+              <w:t>14</w:t>
+            </w:r>
+          </w:p>
+        </w:tc>
+        <w:tc>
+          <w:tcPr>
+            <w:tcW w:w="2040" w:type="dxa"/>
+            <w:vAlign w:val="center"/>
+            <w:hideMark/>
+          </w:tcPr>
+          <w:p>
+            <w:r>
+              <w:t>Quản lý vé</w:t>
+            </w:r>
+          </w:p>
+        </w:tc>
+        <w:tc>
+          <w:tcPr>
+            <w:tcW w:w="3562" w:type="dxa"/>
+            <w:vAlign w:val="center"/>
+            <w:hideMark/>
+          </w:tcPr>
+          <w:p>
+            <w:r>
+              <w:t>Tạo vé điện tử, mã QR, kiểm vé, in vé</w:t>
+            </w:r>
+          </w:p>
+        </w:tc>
+        <w:tc>
+          <w:tcPr>
+            <w:tcW w:w="0" w:type="auto"/>
+            <w:vAlign w:val="center"/>
+            <w:hideMark/>
+          </w:tcPr>
+          <w:p>
+            <w:r>
+              <w:t>tickets, bookings, booking_details</w:t>
+            </w:r>
+          </w:p>
+        </w:tc>
+      </w:tr>
+      <w:tr>
+        <w:trPr>
+          <w:tblCellSpacing w:w="15" w:type="dxa"/>
+        </w:trPr>
+        <w:tc>
+          <w:tcPr>
+            <w:tcW w:w="495" w:type="dxa"/>
+            <w:vAlign w:val="center"/>
+            <w:hideMark/>
+          </w:tcPr>
+          <w:p>
+            <w:r>
               <w:lastRenderedPageBreak/>
-              <w:t>14</w:t>
-            </w:r>
-          </w:p>
-        </w:tc>
-        <w:tc>
-          <w:tcPr>
-            <w:tcW w:w="2040" w:type="dxa"/>
-            <w:vAlign w:val="center"/>
-            <w:hideMark/>
-          </w:tcPr>
-          <w:p>
-            <w:r>
-              <w:t>Quản lý vé</w:t>
-            </w:r>
-          </w:p>
-        </w:tc>
-        <w:tc>
-          <w:tcPr>
-            <w:tcW w:w="3562" w:type="dxa"/>
-            <w:vAlign w:val="center"/>
-            <w:hideMark/>
-          </w:tcPr>
-          <w:p>
-            <w:r>
-              <w:t>Tạo vé điện tử, mã QR, kiểm vé, in vé</w:t>
-            </w:r>
-          </w:p>
-        </w:tc>
-        <w:tc>
-          <w:tcPr>
-            <w:tcW w:w="0" w:type="auto"/>
-            <w:vAlign w:val="center"/>
-            <w:hideMark/>
-          </w:tcPr>
-          <w:p>
-            <w:r>
-              <w:t>tickets, bookings, booking_details</w:t>
-            </w:r>
-          </w:p>
-        </w:tc>
-      </w:tr>
-      <w:tr>
-        <w:trPr>
-          <w:tblCellSpacing w:w="15" w:type="dxa"/>
-        </w:trPr>
-        <w:tc>
-          <w:tcPr>
-            <w:tcW w:w="495" w:type="dxa"/>
-            <w:vAlign w:val="center"/>
-            <w:hideMark/>
-          </w:tcPr>
-          <w:p>
-            <w:r>
               <w:t>15</w:t>
             </w:r>
           </w:p>

</xml_diff>